<commit_message>
PROFANE ATTACK v2.0: new WAV from the edited texts
The WAV is rebuilt from the listing with the GitHub edits (ON BASTIONS
OF RETRO IT, KILLER HDD, FIGHTING!, new round messages) and decoded
back. Two edited lines did not fit the 26-character display and are
shortened: line 340 shows "41 RETRO 90 KILLER HDD", line 760
"KILLER HDD n API n". Checked in the BASIC simulator: no errors, no
line longer than 26 characters. The instructions show the new screen
texts.

Co-Authored-By: Claude Opus 5.5 <noreply@anthropic.com>
Claude-Session: https://claude.ai/code/session_014MnrG7cc1Hws3poqmcDFnM
</commit_message>
<xml_diff>
--- a/instructions_v2.0.docx
+++ b/instructions_v2.0.docx
@@ -436,7 +436,7 @@
           <w:rFonts w:ascii="Courier New" w:eastAsia="Courier New" w:hAnsi="Courier New" w:cs="Courier New"/>
           <w:lang w:val="en-GB"/>
         </w:rPr>
-        <w:t>CONQUER BASTIONS OF FAITH</w:t>
+        <w:t>ON BASTIONS OF RETRO IT</w:t>
       </w:r>
       <w:r>
         <w:rPr>
@@ -3447,7 +3447,7 @@
           <w:rFonts w:ascii="Courier New" w:eastAsia="Courier New" w:hAnsi="Courier New" w:cs="Courier New"/>
           <w:lang w:val="en-GB"/>
         </w:rPr>
-        <w:t xml:space="preserve">KILLER DRIVES?</w:t>
+        <w:t xml:space="preserve">KILLER HDD?</w:t>
       </w:r>
       <w:r>
         <w:rPr>
@@ -3473,7 +3473,7 @@
           <w:rFonts w:ascii="Courier New" w:eastAsia="Courier New" w:hAnsi="Courier New" w:cs="Courier New"/>
           <w:lang w:val="en-GB"/>
         </w:rPr>
-        <w:t xml:space="preserve">YOU HAVE 20 DRIVES</w:t>
+        <w:t xml:space="preserve">YOU HAVE 20 KILLER HDD</w:t>
       </w:r>
       <w:r>
         <w:rPr>
@@ -3544,7 +3544,7 @@
           <w:rFonts w:ascii="Courier New" w:eastAsia="Courier New" w:hAnsi="Courier New" w:cs="Courier New"/>
           <w:lang w:val="en-GB"/>
         </w:rPr>
-        <w:t xml:space="preserve">HACKING!</w:t>
+        <w:t xml:space="preserve">FIGHTING!</w:t>
       </w:r>
       <w:r>
         <w:rPr>
@@ -3704,7 +3704,7 @@
           <w:rFonts w:ascii="Courier New" w:eastAsia="Courier New" w:hAnsi="Courier New" w:cs="Courier New"/>
           <w:lang w:val="en-GB"/>
         </w:rPr>
-        <w:t xml:space="preserve">Hackers run Killer Drives!</w:t>
+        <w:t xml:space="preserve">Hackers launch Killer HDD!</w:t>
       </w:r>
       <w:r>
         <w:rPr>
@@ -3717,7 +3717,7 @@
           <w:rFonts w:ascii="Courier New" w:eastAsia="Courier New" w:hAnsi="Courier New" w:cs="Courier New"/>
           <w:lang w:val="en-GB"/>
         </w:rPr>
-        <w:t xml:space="preserve">Ghosts: plague of worms!</w:t>
+        <w:t xml:space="preserve">Ghosts cast worms plague!</w:t>
       </w:r>
       <w:r>
         <w:rPr>
@@ -3730,7 +3730,7 @@
           <w:rFonts w:ascii="Courier New" w:eastAsia="Courier New" w:hAnsi="Courier New" w:cs="Courier New"/>
           <w:lang w:val="en-GB"/>
         </w:rPr>
-        <w:t xml:space="preserve">Gurus: Dependency Hell!</w:t>
+        <w:t xml:space="preserve">Gurus do Dependency Hell!</w:t>
       </w:r>
       <w:r>
         <w:rPr>
@@ -3823,7 +3823,7 @@
           <w:rFonts w:ascii="Courier New" w:eastAsia="Courier New" w:hAnsi="Courier New" w:cs="Courier New"/>
           <w:lang w:val="en-GB"/>
         </w:rPr>
-        <w:t xml:space="preserve">r RETRO STUFF c DRIVES</w:t>
+        <w:t xml:space="preserve">r RETRO c KILLER HDD</w:t>
       </w:r>
     </w:p>
     <w:p>
@@ -5290,7 +5290,7 @@
           <w:rFonts w:ascii="Courier New" w:eastAsia="Courier New" w:hAnsi="Courier New" w:cs="Courier New"/>
           <w:lang w:val="en-GB"/>
         </w:rPr>
-        <w:t xml:space="preserve">DRIVES</w:t>
+        <w:t xml:space="preserve">KILLER HDD</w:t>
       </w:r>
       <w:r>
         <w:rPr>
@@ -5303,7 +5303,7 @@
           <w:rFonts w:ascii="Courier New" w:eastAsia="Courier New" w:hAnsi="Courier New" w:cs="Courier New"/>
           <w:lang w:val="en-GB"/>
         </w:rPr>
-        <w:t xml:space="preserve">API KEYS</w:t>
+        <w:t xml:space="preserve">API</w:t>
       </w:r>
       <w:r>
         <w:rPr>

</xml_diff>

<commit_message>
PROFANE ATTACK v2.0: Toccata tones with the round messages
The messages Hackers launch Killer HDD!, Ghosts cast worms plague! and
Gurus set Dependency Hell no longer wait a second each: they come with
the last three notes of the second phrase of Bach's Toccata (line 849,
DATA 994). The melody routine uses Q, the hit chance, as its scratch
variable, so 849 sets Q back to .5 afterwards. Keeps the GitHub text
edits (ENTER=FIGHT, Gurus set Dependency Hell). Checked in the BASIC
simulator: same fight results as before, no errors, no line longer
than 26 characters. 5526 bytes without REMs; WAV and instructions
updated.

Co-Authored-By: Claude Opus 5.5 <noreply@anthropic.com>
Claude-Session: https://claude.ai/code/session_014MnrG7cc1Hws3poqmcDFnM
</commit_message>
<xml_diff>
--- a/instructions_v2.0.docx
+++ b/instructions_v2.0.docx
@@ -165,7 +165,7 @@
         <w:rPr>
           <w:lang w:val="en-GB"/>
         </w:rPr>
-        <w:t xml:space="preserve"> with a RAM module (CE-151 or larger). The recording holds the program without its REM lines (5467 bytes); with its variables it needs about 5.9 KB of memory, so it does not fit into a PC-1500 or PC-2 without a module.</w:t>
+        <w:t xml:space="preserve"> with a RAM module (CE-151 or larger). The recording holds the program without its REM lines (5526 bytes); with its variables it needs about 5.9 KB of memory, so it does not fit into a PC-1500 or PC-2 without a module.</w:t>
       </w:r>
     </w:p>
     <w:p>
@@ -3512,7 +3512,7 @@
           <w:rFonts w:ascii="Courier New" w:eastAsia="Courier New" w:hAnsi="Courier New" w:cs="Courier New"/>
           <w:lang w:val="en-GB"/>
         </w:rPr>
-        <w:t xml:space="preserve">ENTER=HACK 3=RETREAT</w:t>
+        <w:t xml:space="preserve">ENTER=FIGHT 3=RETREAT</w:t>
       </w:r>
       <w:r>
         <w:rPr>
@@ -3730,13 +3730,13 @@
           <w:rFonts w:ascii="Courier New" w:eastAsia="Courier New" w:hAnsi="Courier New" w:cs="Courier New"/>
           <w:lang w:val="en-GB"/>
         </w:rPr>
-        <w:t xml:space="preserve">Gurus do Dependency Hell!</w:t>
-      </w:r>
-      <w:r>
-        <w:rPr>
-          <w:lang w:val="en-GB"/>
-        </w:rPr>
-        <w:t xml:space="preserve">, before the next round.</w:t>
+        <w:t xml:space="preserve">Gurus set Dependency Hell</w:t>
+      </w:r>
+      <w:r>
+        <w:rPr>
+          <w:lang w:val="en-GB"/>
+        </w:rPr>
+        <w:t xml:space="preserve">, before the next round. Each of these messages comes with the last three notes of the second phrase of Bach’s Toccata.</w:t>
       </w:r>
     </w:p>
     <w:p>

</xml_diff>

<commit_message>
PROFANE ATTACK v2.0: new WAV for the new start screens
WAV rebuilt from the listing with the GitHub edit (CONQUER THE BASTIONS
with the opening of the Toccata, then OF RETROCOMPUTING !) and decoded
back: 5527 bytes without REMs. Checked in the BASIC simulator: no
errors, no line longer than 26 characters. The instructions describe
the new start screens.

Co-Authored-By: Claude Opus 5.5 <noreply@anthropic.com>
Claude-Session: https://claude.ai/code/session_014MnrG7cc1Hws3poqmcDFnM
</commit_message>
<xml_diff>
--- a/instructions_v2.0.docx
+++ b/instructions_v2.0.docx
@@ -165,7 +165,7 @@
         <w:rPr>
           <w:lang w:val="en-GB"/>
         </w:rPr>
-        <w:t xml:space="preserve"> with a RAM module (CE-151 or larger). The recording holds the program without its REM lines (5526 bytes); with its variables it needs about 5.9 KB of memory, so it does not fit into a PC-1500 or PC-2 without a module.</w:t>
+        <w:t xml:space="preserve"> with a RAM module (CE-151 or larger). The recording holds the program without its REM lines (5527 bytes); with its variables it needs about 5.9 KB of memory, so it does not fit into a PC-1500 or PC-2 without a module.</w:t>
       </w:r>
     </w:p>
     <w:p>
@@ -423,20 +423,33 @@
           <w:rFonts w:ascii="Courier New" w:eastAsia="Courier New" w:hAnsi="Courier New" w:cs="Courier New"/>
           <w:lang w:val="en-GB"/>
         </w:rPr>
-        <w:t>Starting..</w:t>
-      </w:r>
-      <w:r>
-        <w:rPr>
-          <w:lang w:val="en-GB"/>
-        </w:rPr>
-        <w:t xml:space="preserve"> while it prepares the places, then its title while it plays the opening of J.S. Bach’s Toccata in D minor, then </w:t>
+        <w:t xml:space="preserve">Starting..</w:t>
+      </w:r>
+      <w:r>
+        <w:rPr>
+          <w:lang w:val="en-GB"/>
+        </w:rPr>
+        <w:t xml:space="preserve"> while it prepares the places, then </w:t>
       </w:r>
       <w:r>
         <w:rPr>
           <w:rFonts w:ascii="Courier New" w:eastAsia="Courier New" w:hAnsi="Courier New" w:cs="Courier New"/>
           <w:lang w:val="en-GB"/>
         </w:rPr>
-        <w:t>ON BASTIONS OF RETRO IT</w:t>
+        <w:t xml:space="preserve">CONQUER THE BASTIONS</w:t>
+      </w:r>
+      <w:r>
+        <w:rPr>
+          <w:lang w:val="en-GB"/>
+        </w:rPr>
+        <w:t xml:space="preserve"> while it plays the opening of J.S. Bach’s Toccata in D minor, then </w:t>
+      </w:r>
+      <w:r>
+        <w:rPr>
+          <w:rFonts w:ascii="Courier New" w:eastAsia="Courier New" w:hAnsi="Courier New" w:cs="Courier New"/>
+          <w:lang w:val="en-GB"/>
+        </w:rPr>
+        <w:t xml:space="preserve">OF RETROCOMPUTING !</w:t>
       </w:r>
       <w:r>
         <w:rPr>

</xml_diff>

<commit_message>
PROFANE ATTACK v2.0: new WAV for the edited start screen
WAV rebuilt from the GitHub edit: CONQUER THE BASTIONS while the places
are prepared, then OF RETROCOMPUTING ! with the Toccata; GAME OVER!
Priests won!. Decoded back, 5549 bytes without REMs; checked in the
BASIC simulator (no errors, every line within 26 characters).
Instructions updated.

Co-Authored-By: Claude Opus 5.5 <noreply@anthropic.com>
Claude-Session: https://claude.ai/code/session_014MnrG7cc1Hws3poqmcDFnM
</commit_message>
<xml_diff>
--- a/instructions_v2.0.docx
+++ b/instructions_v2.0.docx
@@ -165,7 +165,7 @@
         <w:rPr>
           <w:lang w:val="en-GB"/>
         </w:rPr>
-        <w:t xml:space="preserve"> with a RAM module (CE-151 or larger). The recording holds the program without its REM lines (5553 bytes); with its variables it needs about 5.9 KB of memory, so it does not fit into a PC-1500 or PC-2 without a module.</w:t>
+        <w:t xml:space="preserve"> with a RAM module (CE-151 or larger). The recording holds the program without its REM lines (5549 bytes); with its variables it needs about 5.9 KB of memory, so it does not fit into a PC-1500 or PC-2 without a module.</w:t>
       </w:r>
     </w:p>
     <w:p>
@@ -429,7 +429,7 @@
         <w:rPr>
           <w:lang w:val="en-GB"/>
         </w:rPr>
-        <w:t xml:space="preserve"> while it prepares the places and plays the opening of J.S. Bach’s Toccata in D minor, then </w:t>
+        <w:t xml:space="preserve"> while it prepares the places, then </w:t>
       </w:r>
       <w:r>
         <w:rPr>
@@ -442,7 +442,7 @@
         <w:rPr>
           <w:lang w:val="en-GB"/>
         </w:rPr>
-        <w:t xml:space="preserve"> and the main menu:</w:t>
+        <w:t xml:space="preserve"> while it plays the opening of J.S. Bach’s Toccata in D minor, and the main menu:</w:t>
       </w:r>
     </w:p>
     <w:p>
@@ -4051,7 +4051,7 @@
           <w:rFonts w:ascii="Courier New" w:eastAsia="Courier New" w:hAnsi="Courier New" w:cs="Courier New"/>
           <w:lang w:val="en-GB"/>
         </w:rPr>
-        <w:t xml:space="preserve">GAME OVER! Priests won</w:t>
+        <w:t xml:space="preserve">GAME OVER! Priests won!</w:t>
       </w:r>
       <w:r>
         <w:rPr>
@@ -5496,7 +5496,7 @@
           <w:rFonts w:ascii="Courier New" w:eastAsia="Courier New" w:hAnsi="Courier New" w:cs="Courier New"/>
           <w:lang w:val="en-GB"/>
         </w:rPr>
-        <w:t xml:space="preserve">GAME OVER! Priests won</w:t>
+        <w:t xml:space="preserve">GAME OVER! Priests won!</w:t>
       </w:r>
       <w:r>
         <w:rPr>

</xml_diff>

<commit_message>
v2.0: skip the loss report on GAME OVER (saves 213 bytes)
A lost fight always ends the game, so the losses and LOST GOLD/RETRO
screens are dropped: YOU LOST! -> NO ONE LEFT! -> GAME OVER! Priests won!
Program 5336 bytes; new recording and instructions.

Co-Authored-By: Claude Opus 5.5 <noreply@anthropic.com>
Claude-Session: https://claude.ai/code/session_014MnrG7cc1Hws3poqmcDFnM
</commit_message>
<xml_diff>
--- a/instructions_v2.0.docx
+++ b/instructions_v2.0.docx
@@ -165,7 +165,7 @@
         <w:rPr>
           <w:lang w:val="en-GB"/>
         </w:rPr>
-        <w:t xml:space="preserve"> with a RAM module (CE-151 or larger). The recording holds the program without its REM lines (5549 bytes); with its variables it needs about 5.9 KB of memory, so it does not fit into a PC-1500 or PC-2 without a module.</w:t>
+        <w:t xml:space="preserve"> with a RAM module (CE-151 or larger). The recording holds the program without its REM lines (5336 bytes); with its variables it needs about 5.9 KB of memory, so it does not fit into a PC-1500 or PC-2 without a module.</w:t>
       </w:r>
     </w:p>
     <w:p>
@@ -4018,20 +4018,13 @@
         <w:rPr>
           <w:lang w:val="en-GB"/>
         </w:rPr>
-        <w:t xml:space="preserve"> appears in the middle of the display while a falling melody plays, and then it blinks three times. Your losses follow; these screens change by themselves, about 1.5 seconds each. The CC also takes some of your gold and retro stuff: </w:t>
-      </w:r>
-      <w:r>
-        <w:rPr>
-          <w:rFonts w:ascii="Courier New" w:eastAsia="Courier New" w:hAnsi="Courier New" w:cs="Courier New"/>
-          <w:lang w:val="en-GB"/>
-        </w:rPr>
-        <w:t xml:space="preserve">LOST g GOLD, r RETRO</w:t>
-      </w:r>
-      <w:r>
-        <w:rPr>
-          <w:lang w:val="en-GB"/>
-        </w:rPr>
-        <w:t xml:space="preserve">. As a fight only ends when one side has nobody left, a lost fight always means </w:t>
+        <w:t xml:space="preserve"> appears in the middle of the display while a falling melody plays, and then it blinks three times.</w:t>
+      </w:r>
+      <w:r>
+        <w:rPr>
+          <w:lang w:val="en-GB"/>
+        </w:rPr>
+        <w:t xml:space="preserve"> As a fight only ends when one side has nobody left, a lost fight always means </w:t>
       </w:r>
       <w:r>
         <w:rPr>

</xml_diff>

<commit_message>
v2.0: S = surrender during a fight
From the second round, while you have fewer people than the Tech Priests,
an S appears at the right of the round screen; pressing it ends the fight:
you keep your people and the unused Killer Drives and API keys, the place
keeps only the Tech Priests it has left. The round screen now reads
ROUND r:CC m YOU p. Program 5548 bytes; new recording, instructions, README.

Co-Authored-By: Claude Opus 5.5 <noreply@anthropic.com>
Claude-Session: https://claude.ai/code/session_014MnrG7cc1Hws3poqmcDFnM
</commit_message>
<xml_diff>
--- a/instructions_v2.0.docx
+++ b/instructions_v2.0.docx
@@ -165,7 +165,7 @@
         <w:rPr>
           <w:lang w:val="en-GB"/>
         </w:rPr>
-        <w:t xml:space="preserve"> with a RAM module (CE-151 or larger). The recording holds the program without its REM lines (5336 bytes); with its variables it needs about 5.9 KB of memory, so it does not fit into a PC-1500 or PC-2 without a module.</w:t>
+        <w:t xml:space="preserve"> with a RAM module (CE-151 or larger). The recording holds the program without its REM lines (5548 bytes); with its variables it needs about 5.9 KB of memory, so it does not fit into a PC-1500 or PC-2 without a module.</w:t>
       </w:r>
     </w:p>
     <w:p>
@@ -3639,7 +3639,7 @@
           <w:rFonts w:ascii="Courier New" w:eastAsia="Courier New" w:hAnsi="Courier New" w:cs="Courier New"/>
           <w:lang w:val="en-GB"/>
         </w:rPr>
-        <w:t xml:space="preserve">ROUND1:CC m vs YOU p</w:t>
+        <w:t xml:space="preserve">ROUND1:CC m YOU p</w:t>
       </w:r>
       <w:r>
         <w:rPr>
@@ -3750,7 +3750,7 @@
         <w:rPr>
           <w:lang w:val="en-GB"/>
         </w:rPr>
-        <w:t xml:space="preserve">Every Killer Drive and every API key is used only once. The fight goes on until no Tech Priests or none of your people are left; when all your Killer Drives and API keys have been used, only your gurus strike. A fight cannot be stopped once it has begun. When you win, the Killer Drives and API keys that were not used come back to you.</w:t>
+        <w:t xml:space="preserve">Every Killer Drive and every API key is used only once. The fight goes on until no Tech Priests or none of your people are left; when all your Killer Drives and API keys have been used, only your gurus strike. Once it has begun, a fight can only be stopped by surrendering (see Surrender below). When you win, the Killer Drives and API keys that were not used come back to you.</w:t>
       </w:r>
     </w:p>
     <w:p>
@@ -3997,6 +3997,100 @@
         <w:rPr>
           <w:lang w:val="en-GB"/>
         </w:rPr>
+        <w:t>Surrender</w:t>
+      </w:r>
+    </w:p>
+    <w:p>
+      <w:pPr>
+        <w:spacing w:after="120"/>
+        <w:rPr>
+          <w:lang w:val="en-GB"/>
+        </w:rPr>
+      </w:pPr>
+      <w:r>
+        <w:rPr>
+          <w:lang w:val="en-GB"/>
+        </w:rPr>
+        <w:t xml:space="preserve">From the second round on, while you have fewer people than the Tech Priests still active, an </w:t>
+      </w:r>
+      <w:r>
+        <w:rPr>
+          <w:rFonts w:ascii="Courier New" w:eastAsia="Courier New" w:hAnsi="Courier New" w:cs="Courier New"/>
+          <w:lang w:val="en-GB"/>
+        </w:rPr>
+        <w:t xml:space="preserve">S</w:t>
+      </w:r>
+      <w:r>
+        <w:rPr>
+          <w:lang w:val="en-GB"/>
+        </w:rPr>
+        <w:t xml:space="preserve"> appears at the right end of the round screen, e.g. </w:t>
+      </w:r>
+      <w:r>
+        <w:rPr>
+          <w:rFonts w:ascii="Courier New" w:eastAsia="Courier New" w:hAnsi="Courier New" w:cs="Courier New"/>
+          <w:lang w:val="en-GB"/>
+        </w:rPr>
+        <w:t xml:space="preserve">ROUND3:CC 120 YOU 45     S</w:t>
+      </w:r>
+      <w:r>
+        <w:rPr>
+          <w:lang w:val="en-GB"/>
+        </w:rPr>
+        <w:t xml:space="preserve">. Press S while that screen is on the display (hold the key until the screen changes) and you surrender: </w:t>
+      </w:r>
+      <w:r>
+        <w:rPr>
+          <w:rFonts w:ascii="Courier New" w:eastAsia="Courier New" w:hAnsi="Courier New" w:cs="Courier New"/>
+          <w:lang w:val="en-GB"/>
+        </w:rPr>
+        <w:t xml:space="preserve">YOU SURRENDERED!</w:t>
+      </w:r>
+      <w:r>
+        <w:rPr>
+          <w:lang w:val="en-GB"/>
+        </w:rPr>
+        <w:t xml:space="preserve"> appears in the middle of the display while the falling melody plays, and blinks three times; then your losses in this fight are shown, </w:t>
+      </w:r>
+      <w:r>
+        <w:rPr>
+          <w:rFonts w:ascii="Courier New" w:eastAsia="Courier New" w:hAnsi="Courier New" w:cs="Courier New"/>
+          <w:lang w:val="en-GB"/>
+        </w:rPr>
+        <w:t xml:space="preserve">LOST:m HACK s GHOST j GURU</w:t>
+      </w:r>
+      <w:r>
+        <w:rPr>
+          <w:lang w:val="en-GB"/>
+        </w:rPr>
+        <w:t xml:space="preserve">, and the main menu comes back.</w:t>
+      </w:r>
+    </w:p>
+    <w:p>
+      <w:pPr>
+        <w:spacing w:after="120"/>
+        <w:rPr>
+          <w:lang w:val="en-GB"/>
+        </w:rPr>
+      </w:pPr>
+      <w:r>
+        <w:rPr>
+          <w:lang w:val="en-GB"/>
+        </w:rPr>
+        <w:t xml:space="preserve">You keep the people you still have and the Killer Drives and API keys that were not used; you get no gold, no retro stuff and no new people. The place stays with the CC, but only with the Tech Priests still active: the ones you have eliminated do not come back, so your next attack on that place is easier. When you have as many people as the Tech Priests or more, there is no S: fight on!</w:t>
+      </w:r>
+    </w:p>
+    <w:p>
+      <w:pPr>
+        <w:pStyle w:val="Nagwek2"/>
+        <w:rPr>
+          <w:lang w:val="en-GB"/>
+        </w:rPr>
+      </w:pPr>
+      <w:r>
+        <w:rPr>
+          <w:lang w:val="en-GB"/>
+        </w:rPr>
         <w:t>You lost</w:t>
       </w:r>
     </w:p>
@@ -4024,7 +4118,7 @@
         <w:rPr>
           <w:lang w:val="en-GB"/>
         </w:rPr>
-        <w:t xml:space="preserve"> As a fight only ends when one side has nobody left, a lost fight always means </w:t>
+        <w:t xml:space="preserve"> A fight is lost only when you have nobody left, so a lost fight always means </w:t>
       </w:r>
       <w:r>
         <w:rPr>
@@ -5661,6 +5755,25 @@
           <w:lang w:val="en-GB"/>
         </w:rPr>
         <w:t xml:space="preserve"> to retreat: you lose nothing.</w:t>
+      </w:r>
+    </w:p>
+    <w:p>
+      <w:pPr>
+        <w:pStyle w:val="Akapitzlist"/>
+        <w:numPr>
+          <w:ilvl w:val="0"/>
+          <w:numId w:val="2"/>
+        </w:numPr>
+        <w:spacing w:after="60"/>
+        <w:rPr>
+          <w:lang w:val="en-GB"/>
+        </w:rPr>
+      </w:pPr>
+      <w:r>
+        <w:rPr>
+          <w:lang w:val="en-GB"/>
+        </w:rPr>
+        <w:t xml:space="preserve">A lost fight ends the game. When a fight goes badly, press S in time (from the second round, while you have fewer people than the Tech Priests): you keep your people and your unused drives and keys, and the Tech Priests you have eliminated are gone for good. Then buy what you need and attack the same place again.</w:t>
       </w:r>
     </w:p>
     <w:sectPr>

</xml_diff>

<commit_message>
Instructions, README: nobody gets hurt - people are eliminated by defeating their code
Co-Authored-By: Claude Opus 5.5 <noreply@anthropic.com>
Claude-Session: https://claude.ai/code/session_014MnrG7cc1Hws3poqmcDFnM
</commit_message>
<xml_diff>
--- a/instructions_v2.0.docx
+++ b/instructions_v2.0.docx
@@ -1557,6 +1557,27 @@
           <w:lang w:val="en-GB"/>
         </w:rPr>
         <w:t xml:space="preserve">Your people are ghosts + hackers + gurus. When all of them are gone, the Cathodic Church (CC) wins.</w:t>
+      </w:r>
+    </w:p>
+    <w:p>
+      <w:pPr>
+        <w:spacing w:after="120"/>
+        <w:rPr>
+          <w:lang w:val="en-GB"/>
+        </w:rPr>
+      </w:pPr>
+      <w:r>
+        <w:rPr>
+          <w:b/>
+          <w:lang w:val="en-GB"/>
+        </w:rPr>
+        <w:t xml:space="preserve">Nobody gets hurt in this war.</w:t>
+      </w:r>
+      <w:r>
+        <w:rPr>
+          <w:lang w:val="en-GB"/>
+        </w:rPr>
+        <w:t xml:space="preserve"> It is fought with code, not with swords. When a hacker, a ghost or a guru is “eliminated”, the Tech Priests have defeated their solution, their code or their system: a patch closes the hole, a firewall swallows the worm, a rollback undoes the Dependency Hell, a Killer Drive is wiped clean. The defeated hero leaves the battlefield in one piece, for a long coffee and a complete rewrite. Your people eliminate Tech Priests the same way: their systems crash, and they spend the rest of the war rebooting, reading log files and waiting for the help desk.</w:t>
       </w:r>
     </w:p>
     <w:p>

</xml_diff>

<commit_message>
Title illustration in README and instructions; nobody-gets-hurt text revised
Co-Authored-By: Claude Opus 5.5 <noreply@anthropic.com>
Claude-Session: https://claude.ai/code/session_014MnrG7cc1Hws3poqmcDFnM
</commit_message>
<xml_diff>
--- a/instructions_v2.0.docx
+++ b/instructions_v2.0.docx
@@ -55,6 +55,56 @@
           <w:lang w:val="en-GB"/>
         </w:rPr>
         <w:t xml:space="preserve">Instructions – version 2.0</w:t>
+      </w:r>
+    </w:p>
+    <w:p>
+      <w:pPr>
+        <w:spacing w:after="240"/>
+        <w:jc w:val="center"/>
+        <w:rPr>
+          <w:lang w:val="en-GB"/>
+        </w:rPr>
+      </w:pPr>
+      <w:r>
+        <w:rPr>
+          <w:noProof/>
+          <w:lang w:val="en-GB"/>
+        </w:rPr>
+        <w:drawing>
+          <wp:inline distT="0" distB="0" distL="0" distR="0">
+            <wp:extent cx="6120130" cy="3418666"/>
+            <wp:effectExtent l="0" t="0" r="0" b="0"/>
+            <wp:docPr id="1" name="Title illustration" descr="Hooded Tech Priests among retro computers in a gothic church; a Sharp PC-1500A shows: Gurus created Dependency HELL!!!"/>
+            <wp:cNvGraphicFramePr>
+              <a:graphicFrameLocks xmlns:a="http://schemas.openxmlformats.org/drawingml/2006/main" noChangeAspect="1"/>
+            </wp:cNvGraphicFramePr>
+            <a:graphic xmlns:a="http://schemas.openxmlformats.org/drawingml/2006/main">
+              <a:graphicData uri="http://schemas.openxmlformats.org/drawingml/2006/picture">
+                <pic:pic xmlns:pic="http://schemas.openxmlformats.org/drawingml/2006/picture">
+                  <pic:nvPicPr>
+                    <pic:cNvPr id="1" name="image1.jpeg"/>
+                    <pic:cNvPicPr/>
+                  </pic:nvPicPr>
+                  <pic:blipFill>
+                    <a:blip r:embed="rId20"/>
+                    <a:stretch>
+                      <a:fillRect/>
+                    </a:stretch>
+                  </pic:blipFill>
+                  <pic:spPr>
+                    <a:xfrm>
+                      <a:off x="0" y="0"/>
+                      <a:ext cx="6120130" cy="3418666"/>
+                    </a:xfrm>
+                    <a:prstGeom prst="rect">
+                      <a:avLst/>
+                    </a:prstGeom>
+                  </pic:spPr>
+                </pic:pic>
+              </a:graphicData>
+            </a:graphic>
+          </wp:inline>
+        </w:drawing>
       </w:r>
     </w:p>
     <w:p>
@@ -1577,7 +1627,7 @@
         <w:rPr>
           <w:lang w:val="en-GB"/>
         </w:rPr>
-        <w:t xml:space="preserve"> It is fought with code, not with swords. When a hacker, a ghost or a guru is “eliminated”, the Tech Priests have defeated their solution, their code or their system: a patch closes the hole, a firewall swallows the worm, a rollback undoes the Dependency Hell, a Killer Drive is wiped clean. The defeated hero leaves the battlefield in one piece, for a long coffee and a complete rewrite. Your people eliminate Tech Priests the same way: their systems crash, and they spend the rest of the war rebooting, reading log files and waiting for the help desk.</w:t>
+        <w:t xml:space="preserve"> It is fought with code, not with swords. When a hacker, a ghost or a guru is “eliminated”, the Tech Priests have defeated their solution, their code or their system: a patch closes the hole, a firewall swallows the worm, a rollback undoes the Dependency Hell, a Killer Drive is wiped clean. The defeated hero leaves the battlefield in one piece, for a long relaxation and a complete rewrite. Your people eliminate Tech Priests the same way: their systems crash, and they spend the rest of the war in the Cathodic Church’s retreat centre, waiting for the main spiritual help desk.</w:t>
       </w:r>
     </w:p>
     <w:p>

</xml_diff>

<commit_message>
Valere and Hohensalzburg as places 7-8: new recording, docs follow-up
Tips and README still named Weltenburg; program size 5549 bytes; closing
quote after Miracle Exploit.

Co-Authored-By: Claude Opus 5.5 <noreply@anthropic.com>
Claude-Session: https://claude.ai/code/session_014MnrG7cc1Hws3poqmcDFnM
</commit_message>
<xml_diff>
--- a/instructions_v2.0.docx
+++ b/instructions_v2.0.docx
@@ -313,7 +313,7 @@
         <w:rPr>
           <w:lang w:val="en-GB"/>
         </w:rPr>
-        <w:t xml:space="preserve"> with a RAM module (CE-151 or larger). The recording holds the program without its REM lines (5548 bytes); with its variables it needs about 5.9 KB of memory, so it does not fit into a PC-1500 or PC-2 without a module.</w:t>
+        <w:t xml:space="preserve"> with a RAM module (CE-151 or larger). The recording holds the program without its REM lines (5549 bytes); with its variables it needs about 5.9 KB of memory, so it does not fit into a PC-1500 or PC-2 without a module.</w:t>
       </w:r>
     </w:p>
     <w:p>
@@ -1656,7 +1656,7 @@
         <w:rPr>
           <w:lang w:val="en-GB"/>
         </w:rPr>
-        <w:t>making years of built-up security collapse like a house of cards—unleashing glitches, worm plagues, and system destruction vectors to ultimately crack open the "Miracle Exploit.</w:t>
+        <w:t>making years of built-up security collapse like a house of cards—unleashing glitches, worm plagues, and system destruction vectors to ultimately crack open the “Miracle Exploit”.</w:t>
       </w:r>
       <w:r>
         <w:rPr>
@@ -6639,7 +6639,7 @@
           <w:lang w:val="en-GB"/>
         </w:rPr>
         <w:lastRenderedPageBreak/>
-        <w:t>Save gold and retro stuff from the first places for the rich places 7, 8 and 9: each of them is a big step up, and what one of them gives you is not enough for the next one. If you use up all your gold in every fight, you will not get through Weltenburg and the Vatican.</w:t>
+        <w:t>Save gold and retro stuff from the first places for the rich places 7, 8 and 9: each of them is a big step up, and what one of them gives you is not enough for the next one. If you use up all your gold in every fight, you will not get through Hohensalzburg and the Vatican.</w:t>
       </w:r>
     </w:p>
     <w:p>

</xml_diff>

<commit_message>
Logitech treasure at Valere: new recording; malicious code, Bastions of Vintage IT
Co-Authored-By: Claude Opus 5.5 <noreply@anthropic.com>
Claude-Session: https://claude.ai/code/session_014MnrG7cc1Hws3poqmcDFnM
</commit_message>
<xml_diff>
--- a/instructions_v2.0.docx
+++ b/instructions_v2.0.docx
@@ -132,7 +132,7 @@
         <w:rPr>
           <w:lang w:val="en-GB"/>
         </w:rPr>
-        <w:t xml:space="preserve">The Cathodic Church (CC) – a fictional organisation with a profound interest in vintage computing – maintains ten places across Europe, called Bastions of Faith, numbered 0 to 9: Lourdes (France), Fatima (Portugal), Altotting (Germany), Santiago de Compostela (Spain), Jasna Gora (Poland), Avila (Spain), Loreto (Italy), </w:t>
+        <w:t xml:space="preserve">The Cathodic Church (CC) – a fictional organisation with a profound interest in vintage computing – maintains ten places across Europe, called Bastions of Vintage IT, numbered 0 to 9: Lourdes (France), Fatima (Portugal), Altotting (Germany), Santiago de Compostela (Spain), Jasna Gora (Poland), Avila (Spain), Loreto (Italy), </w:t>
       </w:r>
       <w:r>
         <w:rPr>
@@ -2045,7 +2045,7 @@
         <w:rPr>
           <w:lang w:val="en-GB"/>
         </w:rPr>
-        <w:t>es</w:t>
+        <w:t>e</w:t>
       </w:r>
       <w:r>
         <w:rPr>

</xml_diff>

<commit_message>
Surrender shown as (S) on the round screen; new recording, docs
Co-Authored-By: Claude Opus 5.5 <noreply@anthropic.com>
Claude-Session: https://claude.ai/code/session_014MnrG7cc1Hws3poqmcDFnM
</commit_message>
<xml_diff>
--- a/instructions_v2.0.docx
+++ b/instructions_v2.0.docx
@@ -313,7 +313,7 @@
         <w:rPr>
           <w:lang w:val="en-GB"/>
         </w:rPr>
-        <w:t xml:space="preserve"> with a RAM module (CE-151 or larger). The recording holds the program without its REM lines (5549 bytes); with its variables it needs about 5.9 KB of memory, so it does not fit into a PC-1500 or PC-2 without a module.</w:t>
+        <w:t xml:space="preserve"> with a RAM module (CE-151 or larger). The recording holds the program without its REM lines (5551 bytes); with its variables it needs about 5.9 KB of memory, so it does not fit into a PC-1500 or PC-2 without a module.</w:t>
       </w:r>
     </w:p>
     <w:p>
@@ -4848,14 +4848,14 @@
         <w:rPr>
           <w:lang w:val="en-GB"/>
         </w:rPr>
-        <w:t xml:space="preserve">From the second round on, while you have fewer people than the Tech Priests still active, an </w:t>
-      </w:r>
-      <w:r>
-        <w:rPr>
-          <w:rFonts w:ascii="Courier New" w:eastAsia="Courier New" w:hAnsi="Courier New" w:cs="Courier New"/>
-          <w:lang w:val="en-GB"/>
-        </w:rPr>
-        <w:t>S</w:t>
+        <w:t xml:space="preserve">From the second round on, while you have fewer people than the Tech Priests still active, </w:t>
+      </w:r>
+      <w:r>
+        <w:rPr>
+          <w:rFonts w:ascii="Courier New" w:eastAsia="Courier New" w:hAnsi="Courier New" w:cs="Courier New"/>
+          <w:lang w:val="en-GB"/>
+        </w:rPr>
+        <w:t>(S)</w:t>
       </w:r>
       <w:r>
         <w:rPr>
@@ -4868,7 +4868,7 @@
           <w:rFonts w:ascii="Courier New" w:eastAsia="Courier New" w:hAnsi="Courier New" w:cs="Courier New"/>
           <w:lang w:val="en-GB"/>
         </w:rPr>
-        <w:t>ROUND3:CC 120 YOU 45     S</w:t>
+        <w:t xml:space="preserve">ROUND3:CC 120 YOU 45   ⁠(S)</w:t>
       </w:r>
       <w:r>
         <w:rPr>
@@ -4944,7 +4944,7 @@
         <w:rPr>
           <w:lang w:val="en-GB"/>
         </w:rPr>
-        <w:t>You keep the people you still have and the Killer Drives and API keys that were not used; you get no gold, no retro stuff and no new people. The place stays with the CC, but only with the Tech Priests still active: the ones you have eliminated do not come back, so your next attack on that place is easier. When you have as many people as the Tech Priests or more, there is no S: fight on!</w:t>
+        <w:t>You keep the people you still have and the Killer Drives and API keys that were not used; you get no gold, no retro stuff and no new people. The place stays with the CC, but only with the Tech Priests still active: the ones you have eliminated do not come back, so your next attack on that place is easier. When you have as many people as the Tech Priests or more, there is no (S): fight on!</w:t>
       </w:r>
     </w:p>
     <w:p>

</xml_diff>

<commit_message>
Tidy-up: place names read from DATA, single-letter H/U for hackers/gurus
- no PL$ array: the names are read from the DATA list like the treasures
- W and U freed (K, P), so hackers MC -> H and gurus JH -> U; lost gurus in W
- functions without parentheses around a simple argument (as PEEK RC)
- losses always in the short form LOST:7H 2G 1U; redundant Q = .2 removed
- resources: YOU HAVE: API KEYS n / KILLER DRIVES n / people / GOLD n RETROSTUFF n
Program 5349 bytes (was 5557), about 400 bytes more free memory; new recording.

Co-Authored-By: Claude Opus 5.5 <noreply@anthropic.com>
Claude-Session: https://claude.ai/code/session_014MnrG7cc1Hws3poqmcDFnM
</commit_message>
<xml_diff>
--- a/instructions_v2.0.docx
+++ b/instructions_v2.0.docx
@@ -313,7 +313,7 @@
         <w:rPr>
           <w:lang w:val="en-GB"/>
         </w:rPr>
-        <w:t xml:space="preserve"> with a RAM module (CE-151 or larger). The recording holds the program without its REM lines (5557 bytes); with its variables it needs about 5.9 KB of memory, so it does not fit into a PC-1500 or PC-2 without a module.</w:t>
+        <w:t xml:space="preserve"> with a RAM module (CE-151 or larger). The recording holds the program without its REM lines (5349 bytes); with its variables it needs about 5.6 KB of memory, so it does not fit into a PC-1500 or PC-2 without a module.</w:t>
       </w:r>
     </w:p>
     <w:p>
@@ -4578,7 +4578,7 @@
           <w:lang w:val="en-GB"/>
         </w:rPr>
         <w:lastRenderedPageBreak/>
-        <w:t>LOST:m</w:t>
+        <w:t xml:space="preserve">LOST:mH sG jU</w:t>
       </w:r>
       <w:proofErr w:type="spellEnd"/>
       <w:r>
@@ -4586,28 +4586,28 @@
           <w:rFonts w:ascii="Courier New" w:eastAsia="Courier New" w:hAnsi="Courier New" w:cs="Courier New"/>
           <w:lang w:val="en-GB"/>
         </w:rPr>
-        <w:t xml:space="preserve"> HACK s </w:t>
-      </w:r>
-      <w:r>
-        <w:rPr>
-          <w:rFonts w:ascii="Courier New" w:eastAsia="Courier New" w:hAnsi="Courier New" w:cs="Courier New"/>
-          <w:lang w:val="en-GB"/>
-        </w:rPr>
-        <w:t>GHOST</w:t>
-      </w:r>
-      <w:r>
-        <w:rPr>
-          <w:rFonts w:ascii="Courier New" w:eastAsia="Courier New" w:hAnsi="Courier New" w:cs="Courier New"/>
-          <w:lang w:val="en-GB"/>
-        </w:rPr>
-        <w:t xml:space="preserve"> j </w:t>
-      </w:r>
-      <w:r>
-        <w:rPr>
-          <w:rFonts w:ascii="Courier New" w:eastAsia="Courier New" w:hAnsi="Courier New" w:cs="Courier New"/>
-          <w:lang w:val="en-GB"/>
-        </w:rPr>
-        <w:t>GURU</w:t>
+        <w:t xml:space="preserve"/>
+      </w:r>
+      <w:r>
+        <w:rPr>
+          <w:rFonts w:ascii="Courier New" w:eastAsia="Courier New" w:hAnsi="Courier New" w:cs="Courier New"/>
+          <w:lang w:val="en-GB"/>
+        </w:rPr>
+        <w:t xml:space="preserve"/>
+      </w:r>
+      <w:r>
+        <w:rPr>
+          <w:rFonts w:ascii="Courier New" w:eastAsia="Courier New" w:hAnsi="Courier New" w:cs="Courier New"/>
+          <w:lang w:val="en-GB"/>
+        </w:rPr>
+        <w:t xml:space="preserve"/>
+      </w:r>
+      <w:r>
+        <w:rPr>
+          <w:rFonts w:ascii="Courier New" w:eastAsia="Courier New" w:hAnsi="Courier New" w:cs="Courier New"/>
+          <w:lang w:val="en-GB"/>
+        </w:rPr>
+        <w:t xml:space="preserve"/>
       </w:r>
     </w:p>
     <w:p>
@@ -4626,14 +4626,14 @@
         <w:rPr>
           <w:lang w:val="en-GB"/>
         </w:rPr>
-        <w:t xml:space="preserve">Your losses in this fight. A line too long for the display is shortened, e.g. </w:t>
-      </w:r>
-      <w:r>
-        <w:rPr>
-          <w:rFonts w:ascii="Courier New" w:eastAsia="Courier New" w:hAnsi="Courier New" w:cs="Courier New"/>
-          <w:lang w:val="en-GB"/>
-        </w:rPr>
-        <w:t>LOST:750H 0G 31U</w:t>
+        <w:t xml:space="preserve">Your losses in this fight, e.g. </w:t>
+      </w:r>
+      <w:r>
+        <w:rPr>
+          <w:rFonts w:ascii="Courier New" w:eastAsia="Courier New" w:hAnsi="Courier New" w:cs="Courier New"/>
+          <w:lang w:val="en-GB"/>
+        </w:rPr>
+        <w:t>LOST:7H 2G 1U</w:t>
       </w:r>
       <w:r>
         <w:rPr>
@@ -4895,7 +4895,7 @@
           <w:rFonts w:ascii="Courier New" w:eastAsia="Courier New" w:hAnsi="Courier New" w:cs="Courier New"/>
           <w:lang w:val="en-GB"/>
         </w:rPr>
-        <w:t>LOST:m</w:t>
+        <w:t xml:space="preserve">LOST:mH sG jU</w:t>
       </w:r>
       <w:proofErr w:type="spellEnd"/>
       <w:r>
@@ -4903,28 +4903,28 @@
           <w:rFonts w:ascii="Courier New" w:eastAsia="Courier New" w:hAnsi="Courier New" w:cs="Courier New"/>
           <w:lang w:val="en-GB"/>
         </w:rPr>
-        <w:t xml:space="preserve"> HACK s </w:t>
-      </w:r>
-      <w:r>
-        <w:rPr>
-          <w:rFonts w:ascii="Courier New" w:eastAsia="Courier New" w:hAnsi="Courier New" w:cs="Courier New"/>
-          <w:lang w:val="en-GB"/>
-        </w:rPr>
-        <w:t>GHOST</w:t>
-      </w:r>
-      <w:r>
-        <w:rPr>
-          <w:rFonts w:ascii="Courier New" w:eastAsia="Courier New" w:hAnsi="Courier New" w:cs="Courier New"/>
-          <w:lang w:val="en-GB"/>
-        </w:rPr>
-        <w:t xml:space="preserve"> j </w:t>
-      </w:r>
-      <w:r>
-        <w:rPr>
-          <w:rFonts w:ascii="Courier New" w:eastAsia="Courier New" w:hAnsi="Courier New" w:cs="Courier New"/>
-          <w:lang w:val="en-GB"/>
-        </w:rPr>
-        <w:t>GURU</w:t>
+        <w:t xml:space="preserve"/>
+      </w:r>
+      <w:r>
+        <w:rPr>
+          <w:rFonts w:ascii="Courier New" w:eastAsia="Courier New" w:hAnsi="Courier New" w:cs="Courier New"/>
+          <w:lang w:val="en-GB"/>
+        </w:rPr>
+        <w:t xml:space="preserve"/>
+      </w:r>
+      <w:r>
+        <w:rPr>
+          <w:rFonts w:ascii="Courier New" w:eastAsia="Courier New" w:hAnsi="Courier New" w:cs="Courier New"/>
+          <w:lang w:val="en-GB"/>
+        </w:rPr>
+        <w:t xml:space="preserve"/>
+      </w:r>
+      <w:r>
+        <w:rPr>
+          <w:rFonts w:ascii="Courier New" w:eastAsia="Courier New" w:hAnsi="Courier New" w:cs="Courier New"/>
+          <w:lang w:val="en-GB"/>
+        </w:rPr>
+        <w:t xml:space="preserve"/>
       </w:r>
       <w:r>
         <w:rPr>
@@ -6229,111 +6229,111 @@
         <w:rPr>
           <w:lang w:val="en-GB"/>
         </w:rPr>
-        <w:t xml:space="preserve">Press R. After </w:t>
-      </w:r>
-      <w:r>
-        <w:rPr>
-          <w:rFonts w:ascii="Courier New" w:eastAsia="Courier New" w:hAnsi="Courier New" w:cs="Courier New"/>
-          <w:lang w:val="en-GB"/>
-        </w:rPr>
-        <w:t>YOU HAVE:</w:t>
-      </w:r>
-      <w:r>
-        <w:rPr>
-          <w:lang w:val="en-GB"/>
-        </w:rPr>
-        <w:t xml:space="preserve"> the game shows your people (</w:t>
-      </w:r>
-      <w:r>
-        <w:rPr>
-          <w:rFonts w:ascii="Courier New" w:eastAsia="Courier New" w:hAnsi="Courier New" w:cs="Courier New"/>
-          <w:lang w:val="en-GB"/>
-        </w:rPr>
-        <w:t>GHOST</w:t>
-      </w:r>
-      <w:r>
-        <w:rPr>
-          <w:lang w:val="en-GB"/>
-        </w:rPr>
-        <w:t xml:space="preserve">, </w:t>
-      </w:r>
-      <w:r>
-        <w:rPr>
-          <w:rFonts w:ascii="Courier New" w:eastAsia="Courier New" w:hAnsi="Courier New" w:cs="Courier New"/>
-          <w:lang w:val="en-GB"/>
-        </w:rPr>
-        <w:t>HACK</w:t>
-      </w:r>
-      <w:r>
-        <w:rPr>
-          <w:lang w:val="en-GB"/>
-        </w:rPr>
-        <w:t xml:space="preserve">, </w:t>
-      </w:r>
-      <w:r>
-        <w:rPr>
-          <w:rFonts w:ascii="Courier New" w:eastAsia="Courier New" w:hAnsi="Courier New" w:cs="Courier New"/>
-          <w:lang w:val="en-GB"/>
-        </w:rPr>
-        <w:t>GURU</w:t>
-      </w:r>
-      <w:r>
-        <w:rPr>
-          <w:lang w:val="en-GB"/>
-        </w:rPr>
-        <w:t>), your weapons (</w:t>
-      </w:r>
-      <w:r>
-        <w:rPr>
-          <w:rFonts w:ascii="Courier New" w:eastAsia="Courier New" w:hAnsi="Courier New" w:cs="Courier New"/>
-          <w:lang w:val="en-GB"/>
-        </w:rPr>
-        <w:t>KILLER DRIVES</w:t>
-      </w:r>
-      <w:r>
-        <w:rPr>
-          <w:lang w:val="en-GB"/>
-        </w:rPr>
-        <w:t xml:space="preserve">, </w:t>
-      </w:r>
-      <w:r>
-        <w:rPr>
-          <w:rFonts w:ascii="Courier New" w:eastAsia="Courier New" w:hAnsi="Courier New" w:cs="Courier New"/>
-          <w:lang w:val="en-GB"/>
-        </w:rPr>
-        <w:t>API KEYS</w:t>
-      </w:r>
-      <w:r>
-        <w:rPr>
-          <w:lang w:val="en-GB"/>
-        </w:rPr>
-        <w:t xml:space="preserve">), then your </w:t>
-      </w:r>
-      <w:r>
-        <w:rPr>
-          <w:rFonts w:ascii="Courier New" w:eastAsia="Courier New" w:hAnsi="Courier New" w:cs="Courier New"/>
-          <w:lang w:val="en-GB"/>
-        </w:rPr>
-        <w:t>GOLD</w:t>
-      </w:r>
-      <w:r>
-        <w:rPr>
-          <w:lang w:val="en-GB"/>
-        </w:rPr>
-        <w:t xml:space="preserve"> and </w:t>
-      </w:r>
-      <w:r>
-        <w:rPr>
-          <w:rFonts w:ascii="Courier New" w:eastAsia="Courier New" w:hAnsi="Courier New" w:cs="Courier New"/>
-          <w:lang w:val="en-GB"/>
-        </w:rPr>
-        <w:t>RETRO</w:t>
-      </w:r>
-      <w:r>
-        <w:rPr>
-          <w:lang w:val="en-GB"/>
-        </w:rPr>
-        <w:t xml:space="preserve"> stuff, one screen at a time. Press any key to see the next screen; after the last one the main menu comes back.</w:t>
+        <w:t xml:space="preserve">Press R. The game shows </w:t>
+      </w:r>
+      <w:r>
+        <w:rPr>
+          <w:rFonts w:ascii="Courier New" w:eastAsia="Courier New" w:hAnsi="Courier New" w:cs="Courier New"/>
+          <w:lang w:val="en-GB"/>
+        </w:rPr>
+        <w:t xml:space="preserve">YOU HAVE: API KEYS n</w:t>
+      </w:r>
+      <w:r>
+        <w:rPr>
+          <w:lang w:val="en-GB"/>
+        </w:rPr>
+        <w:t xml:space="preserve">, then </w:t>
+      </w:r>
+      <w:r>
+        <w:rPr>
+          <w:rFonts w:ascii="Courier New" w:eastAsia="Courier New" w:hAnsi="Courier New" w:cs="Courier New"/>
+          <w:lang w:val="en-GB"/>
+        </w:rPr>
+        <w:t xml:space="preserve">KILLER DRIVES n</w:t>
+      </w:r>
+      <w:r>
+        <w:rPr>
+          <w:lang w:val="en-GB"/>
+        </w:rPr>
+        <w:t xml:space="preserve">, your people </w:t>
+      </w:r>
+      <w:r>
+        <w:rPr>
+          <w:rFonts w:ascii="Courier New" w:eastAsia="Courier New" w:hAnsi="Courier New" w:cs="Courier New"/>
+          <w:lang w:val="en-GB"/>
+        </w:rPr>
+        <w:t xml:space="preserve">GHOST n HACK n GURU n</w:t>
+      </w:r>
+      <w:r>
+        <w:rPr>
+          <w:lang w:val="en-GB"/>
+        </w:rPr>
+        <w:t xml:space="preserve"> and last </w:t>
+      </w:r>
+      <w:r>
+        <w:rPr>
+          <w:rFonts w:ascii="Courier New" w:eastAsia="Courier New" w:hAnsi="Courier New" w:cs="Courier New"/>
+          <w:lang w:val="en-GB"/>
+        </w:rPr>
+        <w:t xml:space="preserve">GOLD n RETROSTUFF n</w:t>
+      </w:r>
+      <w:r>
+        <w:rPr>
+          <w:lang w:val="en-GB"/>
+        </w:rPr>
+        <w:t xml:space="preserve">, one screen at a time. Press any key to see the next screen; after the last one the main menu comes back.</w:t>
+      </w:r>
+      <w:r>
+        <w:rPr>
+          <w:rFonts w:ascii="Courier New" w:eastAsia="Courier New" w:hAnsi="Courier New" w:cs="Courier New"/>
+          <w:lang w:val="en-GB"/>
+        </w:rPr>
+        <w:t xml:space="preserve"/>
+      </w:r>
+      <w:r>
+        <w:rPr>
+          <w:lang w:val="en-GB"/>
+        </w:rPr>
+        <w:t xml:space="preserve"/>
+      </w:r>
+      <w:r>
+        <w:rPr>
+          <w:rFonts w:ascii="Courier New" w:eastAsia="Courier New" w:hAnsi="Courier New" w:cs="Courier New"/>
+          <w:lang w:val="en-GB"/>
+        </w:rPr>
+        <w:t xml:space="preserve"/>
+      </w:r>
+      <w:r>
+        <w:rPr>
+          <w:lang w:val="en-GB"/>
+        </w:rPr>
+        <w:t xml:space="preserve"/>
+      </w:r>
+      <w:r>
+        <w:rPr>
+          <w:rFonts w:ascii="Courier New" w:eastAsia="Courier New" w:hAnsi="Courier New" w:cs="Courier New"/>
+          <w:lang w:val="en-GB"/>
+        </w:rPr>
+        <w:t xml:space="preserve"/>
+      </w:r>
+      <w:r>
+        <w:rPr>
+          <w:lang w:val="en-GB"/>
+        </w:rPr>
+        <w:t xml:space="preserve"/>
+      </w:r>
+      <w:r>
+        <w:rPr>
+          <w:rFonts w:ascii="Courier New" w:eastAsia="Courier New" w:hAnsi="Courier New" w:cs="Courier New"/>
+          <w:lang w:val="en-GB"/>
+        </w:rPr>
+        <w:t xml:space="preserve"/>
+      </w:r>
+      <w:r>
+        <w:rPr>
+          <w:lang w:val="en-GB"/>
+        </w:rPr>
+        <w:t xml:space="preserve"/>
       </w:r>
     </w:p>
     <w:p>

</xml_diff>